<commit_message>
plain comments, docs about deploy and Stripe
- short plain comments in OrderController and Custom Studio
- startup log prints the real port
- docs: Render deploy, Stripe keys and webhook, what was fixed
</commit_message>
<xml_diff>
--- a/docs/CODE-DEEP-DIVE.docx
+++ b/docs/CODE-DEEP-DIVE.docx
@@ -17,7 +17,7 @@
     </w:p>
     <w:p>
       <w:r>
-        <w:t xml:space="preserve">Как читать: часть 1 — общая картина и библиотеки. Часть 2 — основы JavaScript, без которых код не понять. Части 3 и 4 — бэкенд и фронтенд по файлам, построчно. Часть 5 — полные цепочки «нажал кнопку → что произошло». Часть 6 — вопросы, которые могут задать, с ответами. Часть 7 — слабые места, о которых лучше знать заранее.</w:t>
+        <w:t xml:space="preserve">Как читать: часть 1 — общая картина и библиотеки. Часть 2 — основы JavaScript, без которых код не понять. Части 3 и 4 — бэкенд и фронтенд по файлам, построчно. Часть 5 — полные цепочки «нажал кнопку → что произошло». Часть 6 — вопросы, которые могут задать, с ответами. Часть 7 — слабые места, о которых лучше знать заранее. Часть 8 — как сайт попадает в интернет (Render) и как подключена оплата (Stripe).</w:t>
       </w:r>
     </w:p>
     <w:p>
@@ -22735,6 +22735,142 @@
       </w:r>
     </w:p>
     <w:p>
+      <w:r>
+        <w:rPr>
+          <w:b/>
+        </w:rPr>
+        <w:t xml:space="preserve">Где хранятся данные карты покупателя?</w:t>
+      </w:r>
+      <w:r>
+        <w:t xml:space="preserve"> Нигде у нас. Карту вводят на странице Stripe Checkout, наш сервер её не видит. Мы получаем только факт оплаты через вебхук и id платежа.</w:t>
+      </w:r>
+    </w:p>
+    <w:p>
+      <w:r>
+        <w:rPr>
+          <w:b/>
+        </w:rPr>
+        <w:t xml:space="preserve">Как обновляется сайт после изменений в коде?</w:t>
+      </w:r>
+      <w:r>
+        <w:t xml:space="preserve"> </w:t>
+      </w:r>
+      <w:r>
+        <w:rPr>
+          <w:rFonts w:ascii="Consolas" w:hAnsi="Consolas" w:cs="Consolas"/>
+          <w:color w:val="B4235A"/>
+          <w:sz w:val="19"/>
+        </w:rPr>
+        <w:t xml:space="preserve">git push</w:t>
+      </w:r>
+      <w:r>
+        <w:t xml:space="preserve"> в ветку </w:t>
+      </w:r>
+      <w:r>
+        <w:rPr>
+          <w:rFonts w:ascii="Consolas" w:hAnsi="Consolas" w:cs="Consolas"/>
+          <w:color w:val="B4235A"/>
+          <w:sz w:val="19"/>
+        </w:rPr>
+        <w:t xml:space="preserve">main</w:t>
+      </w:r>
+      <w:r>
+        <w:t xml:space="preserve"> на GitHub. Render подключён к репозиторию, сам замечает новый коммит и пересобирает фронт и сервер.</w:t>
+      </w:r>
+    </w:p>
+    <w:p>
+      <w:r>
+        <w:rPr>
+          <w:b/>
+        </w:rPr>
+        <w:t xml:space="preserve">Где на сервере лежат секреты, если </w:t>
+      </w:r>
+      <w:r>
+        <w:rPr>
+          <w:b/>
+          <w:rFonts w:ascii="Consolas" w:hAnsi="Consolas" w:cs="Consolas"/>
+          <w:color w:val="B4235A"/>
+          <w:sz w:val="19"/>
+        </w:rPr>
+        <w:t xml:space="preserve">.env</w:t>
+      </w:r>
+      <w:r>
+        <w:rPr>
+          <w:b/>
+        </w:rPr>
+        <w:t xml:space="preserve"> нет в git?</w:t>
+      </w:r>
+      <w:r>
+        <w:t xml:space="preserve"> В настройках сервиса на Render (Environment). Render передаёт их программе как </w:t>
+      </w:r>
+      <w:r>
+        <w:rPr>
+          <w:rFonts w:ascii="Consolas" w:hAnsi="Consolas" w:cs="Consolas"/>
+          <w:color w:val="B4235A"/>
+          <w:sz w:val="19"/>
+        </w:rPr>
+        <w:t xml:space="preserve">process.env</w:t>
+      </w:r>
+      <w:r>
+        <w:t xml:space="preserve">, так же как </w:t>
+      </w:r>
+      <w:r>
+        <w:rPr>
+          <w:rFonts w:ascii="Consolas" w:hAnsi="Consolas" w:cs="Consolas"/>
+          <w:color w:val="B4235A"/>
+          <w:sz w:val="19"/>
+        </w:rPr>
+        <w:t xml:space="preserve">dotenv</w:t>
+      </w:r>
+      <w:r>
+        <w:t xml:space="preserve"> на локальном компьютере.</w:t>
+      </w:r>
+    </w:p>
+    <w:p>
+      <w:r>
+        <w:rPr>
+          <w:b/>
+        </w:rPr>
+        <w:t xml:space="preserve">Почему оплата в шекелях, если на сайте доллары?</w:t>
+      </w:r>
+      <w:r>
+        <w:t xml:space="preserve"> Stripe сам предлагает покупателю местную валюту по курсу. Сессия создаётся в долларах, и в базе заказ хранится в долларах.</w:t>
+      </w:r>
+    </w:p>
+    <w:p>
+      <w:r>
+        <w:rPr>
+          <w:b/>
+        </w:rPr>
+        <w:t xml:space="preserve">Что такое тестовый режим Stripe?</w:t>
+      </w:r>
+      <w:r>
+        <w:t xml:space="preserve"> Отдельная «песочница» с ключами </w:t>
+      </w:r>
+      <w:r>
+        <w:rPr>
+          <w:rFonts w:ascii="Consolas" w:hAnsi="Consolas" w:cs="Consolas"/>
+          <w:color w:val="B4235A"/>
+          <w:sz w:val="19"/>
+        </w:rPr>
+        <w:t xml:space="preserve">sk_test_...</w:t>
+      </w:r>
+      <w:r>
+        <w:t xml:space="preserve">: всё работает как по-настоящему, но деньги не списываются. Для проверки есть тестовые карты, например </w:t>
+      </w:r>
+      <w:r>
+        <w:rPr>
+          <w:rFonts w:ascii="Consolas" w:hAnsi="Consolas" w:cs="Consolas"/>
+          <w:color w:val="B4235A"/>
+          <w:sz w:val="19"/>
+        </w:rPr>
+        <w:t xml:space="preserve">4242 4242 4242 4242</w:t>
+      </w:r>
+      <w:r>
+        <w:t xml:space="preserve">.</w:t>
+      </w:r>
+    </w:p>
+    <w:p>
       <w:pPr>
         <w:pStyle w:val="Heading1"/>
         <w:pageBreakBefore/>
@@ -22817,57 +22953,48 @@
       <w:r>
         <w:rPr>
           <w:b/>
-          <w:rFonts w:ascii="Consolas" w:hAnsi="Consolas" w:cs="Consolas"/>
-          <w:color w:val="B4235A"/>
-          <w:sz w:val="19"/>
-        </w:rPr>
-        <w:t xml:space="preserve">express-mongo-sanitize</w:t>
+        </w:rPr>
+        <w:t xml:space="preserve">Картинки, загруженные через </w:t>
       </w:r>
       <w:r>
         <w:rPr>
           <w:b/>
-        </w:rPr>
-        <w:t xml:space="preserve"> и </w:t>
+          <w:rFonts w:ascii="Consolas" w:hAnsi="Consolas" w:cs="Consolas"/>
+          <w:color w:val="B4235A"/>
+          <w:sz w:val="19"/>
+        </w:rPr>
+        <w:t xml:space="preserve">/admin</w:t>
       </w:r>
       <w:r>
         <w:rPr>
           <w:b/>
-          <w:rFonts w:ascii="Consolas" w:hAnsi="Consolas" w:cs="Consolas"/>
-          <w:color w:val="B4235A"/>
-          <w:sz w:val="19"/>
-        </w:rPr>
-        <w:t xml:space="preserve">xss-clean</w:t>
-      </w:r>
-      <w:r>
-        <w:rPr>
-          <w:b/>
-        </w:rPr>
-        <w:t xml:space="preserve"> установлены, но не подключены.</w:t>
-      </w:r>
-      <w:r>
-        <w:t xml:space="preserve"> Они есть в </w:t>
-      </w:r>
-      <w:r>
-        <w:rPr>
-          <w:rFonts w:ascii="Consolas" w:hAnsi="Consolas" w:cs="Consolas"/>
-          <w:color w:val="B4235A"/>
-          <w:sz w:val="19"/>
-        </w:rPr>
-        <w:t xml:space="preserve">package.json</w:t>
-      </w:r>
-      <w:r>
-        <w:t xml:space="preserve">, но в </w:t>
-      </w:r>
-      <w:r>
-        <w:rPr>
-          <w:rFonts w:ascii="Consolas" w:hAnsi="Consolas" w:cs="Consolas"/>
-          <w:color w:val="B4235A"/>
-          <w:sz w:val="19"/>
-        </w:rPr>
-        <w:t xml:space="preserve">index.js</w:t>
-      </w:r>
-      <w:r>
-        <w:t xml:space="preserve"> их нет. Либо подключить, либо удалить из зависимостей.</w:t>
+        </w:rPr>
+        <w:t xml:space="preserve">, пропадают после пересборки на Render.</w:t>
+      </w:r>
+      <w:r>
+        <w:t xml:space="preserve"> На бесплатном тарифе диск сервера очищается при каждом деплое. Картинки, которые лежат в git (</w:t>
+      </w:r>
+      <w:r>
+        <w:rPr>
+          <w:rFonts w:ascii="Consolas" w:hAnsi="Consolas" w:cs="Consolas"/>
+          <w:color w:val="B4235A"/>
+          <w:sz w:val="19"/>
+        </w:rPr>
+        <w:t xml:space="preserve">back/uploads/bags/...</w:t>
+      </w:r>
+      <w:r>
+        <w:t xml:space="preserve">), восстанавливаются, а новые — нет: в базе товар остаётся, но картинка отвечает 404. Исправление: хранить картинки во внешнем хранилище (например Cloudinary) или подключить на Render постоянный диск. Пока что новую картинку можно закоммитить в </w:t>
+      </w:r>
+      <w:r>
+        <w:rPr>
+          <w:rFonts w:ascii="Consolas" w:hAnsi="Consolas" w:cs="Consolas"/>
+          <w:color w:val="B4235A"/>
+          <w:sz w:val="19"/>
+        </w:rPr>
+        <w:t xml:space="preserve">back/uploads/</w:t>
+      </w:r>
+      <w:r>
+        <w:t xml:space="preserve">.</w:t>
       </w:r>
     </w:p>
     <w:p>
@@ -22876,38 +23003,62 @@
         <w:ind w:left="400" w:hanging="300"/>
       </w:pPr>
       <w:r>
-        <w:t xml:space="preserve">5. </w:t>
+        <w:t xml:space="preserve">4. </w:t>
       </w:r>
       <w:r>
         <w:rPr>
           <w:b/>
-        </w:rPr>
-        <w:t xml:space="preserve">Поиск заказов строит RegExp из введённого текста.</w:t>
-      </w:r>
-      <w:r>
-        <w:t xml:space="preserve"> </w:t>
-      </w:r>
-      <w:r>
-        <w:rPr>
-          <w:rFonts w:ascii="Consolas" w:hAnsi="Consolas" w:cs="Consolas"/>
-          <w:color w:val="B4235A"/>
-          <w:sz w:val="19"/>
-        </w:rPr>
-        <w:t xml:space="preserve">new RegExp(search, 'i')</w:t>
-      </w:r>
-      <w:r>
-        <w:t xml:space="preserve"> — специальные символы в поиске (например </w:t>
-      </w:r>
-      <w:r>
-        <w:rPr>
-          <w:rFonts w:ascii="Consolas" w:hAnsi="Consolas" w:cs="Consolas"/>
-          <w:color w:val="B4235A"/>
-          <w:sz w:val="19"/>
-        </w:rPr>
-        <w:t xml:space="preserve">(</w:t>
-      </w:r>
-      <w:r>
-        <w:t xml:space="preserve">) вызовут ошибку 500, а сложный шаблон может долго выполняться. Доступно только менеджеру, поэтому риск низкий. Исправление: экранировать спецсимволы перед созданием RegExp.</w:t>
+          <w:rFonts w:ascii="Consolas" w:hAnsi="Consolas" w:cs="Consolas"/>
+          <w:color w:val="B4235A"/>
+          <w:sz w:val="19"/>
+        </w:rPr>
+        <w:t xml:space="preserve">express-mongo-sanitize</w:t>
+      </w:r>
+      <w:r>
+        <w:rPr>
+          <w:b/>
+        </w:rPr>
+        <w:t xml:space="preserve"> и </w:t>
+      </w:r>
+      <w:r>
+        <w:rPr>
+          <w:b/>
+          <w:rFonts w:ascii="Consolas" w:hAnsi="Consolas" w:cs="Consolas"/>
+          <w:color w:val="B4235A"/>
+          <w:sz w:val="19"/>
+        </w:rPr>
+        <w:t xml:space="preserve">xss-clean</w:t>
+      </w:r>
+      <w:r>
+        <w:rPr>
+          <w:b/>
+        </w:rPr>
+        <w:t xml:space="preserve"> установлены, но не подключены.</w:t>
+      </w:r>
+      <w:r>
+        <w:t xml:space="preserve"> Они есть в </w:t>
+      </w:r>
+      <w:r>
+        <w:rPr>
+          <w:rFonts w:ascii="Consolas" w:hAnsi="Consolas" w:cs="Consolas"/>
+          <w:color w:val="B4235A"/>
+          <w:sz w:val="19"/>
+        </w:rPr>
+        <w:t xml:space="preserve">package.json</w:t>
+      </w:r>
+      <w:r>
+        <w:t xml:space="preserve">, но в </w:t>
+      </w:r>
+      <w:r>
+        <w:rPr>
+          <w:rFonts w:ascii="Consolas" w:hAnsi="Consolas" w:cs="Consolas"/>
+          <w:color w:val="B4235A"/>
+          <w:sz w:val="19"/>
+        </w:rPr>
+        <w:t xml:space="preserve">index.js</w:t>
+      </w:r>
+      <w:r>
+        <w:t xml:space="preserve"> их нет. Либо подключить, либо удалить из зависимостей.</w:t>
       </w:r>
     </w:p>
     <w:p>
@@ -22916,60 +23067,38 @@
         <w:ind w:left="400" w:hanging="300"/>
       </w:pPr>
       <w:r>
-        <w:t xml:space="preserve">6. </w:t>
+        <w:t xml:space="preserve">5. </w:t>
       </w:r>
       <w:r>
         <w:rPr>
           <w:b/>
         </w:rPr>
-        <w:t xml:space="preserve">Имя и комментарий покупателя вставляются в HTML письма без экранирования.</w:t>
-      </w:r>
-      <w:r>
-        <w:t xml:space="preserve"> Если в поле имени написать HTML-код, он попадёт в письмо менеджеру. Исправление: заменять </w:t>
-      </w:r>
-      <w:r>
-        <w:rPr>
-          <w:rFonts w:ascii="Consolas" w:hAnsi="Consolas" w:cs="Consolas"/>
-          <w:color w:val="B4235A"/>
-          <w:sz w:val="19"/>
-        </w:rPr>
-        <w:t xml:space="preserve">&lt;</w:t>
-      </w:r>
-      <w:r>
-        <w:t xml:space="preserve">, </w:t>
-      </w:r>
-      <w:r>
-        <w:rPr>
-          <w:rFonts w:ascii="Consolas" w:hAnsi="Consolas" w:cs="Consolas"/>
-          <w:color w:val="B4235A"/>
-          <w:sz w:val="19"/>
-        </w:rPr>
-        <w:t xml:space="preserve">&gt;</w:t>
-      </w:r>
-      <w:r>
-        <w:t xml:space="preserve">, </w:t>
-      </w:r>
-      <w:r>
-        <w:rPr>
-          <w:rFonts w:ascii="Consolas" w:hAnsi="Consolas" w:cs="Consolas"/>
-          <w:color w:val="B4235A"/>
-          <w:sz w:val="19"/>
-        </w:rPr>
-        <w:t xml:space="preserve">&amp;</w:t>
-      </w:r>
-      <w:r>
-        <w:t xml:space="preserve">, </w:t>
-      </w:r>
-      <w:r>
-        <w:rPr>
-          <w:rFonts w:ascii="Consolas" w:hAnsi="Consolas" w:cs="Consolas"/>
-          <w:color w:val="B4235A"/>
-          <w:sz w:val="19"/>
-        </w:rPr>
-        <w:t xml:space="preserve">"</w:t>
-      </w:r>
-      <w:r>
-        <w:t xml:space="preserve"> на HTML-сущности.</w:t>
+        <w:t xml:space="preserve">Поиск заказов строит RegExp из введённого текста.</w:t>
+      </w:r>
+      <w:r>
+        <w:t xml:space="preserve"> </w:t>
+      </w:r>
+      <w:r>
+        <w:rPr>
+          <w:rFonts w:ascii="Consolas" w:hAnsi="Consolas" w:cs="Consolas"/>
+          <w:color w:val="B4235A"/>
+          <w:sz w:val="19"/>
+        </w:rPr>
+        <w:t xml:space="preserve">new RegExp(search, 'i')</w:t>
+      </w:r>
+      <w:r>
+        <w:t xml:space="preserve"> — специальные символы в поиске (например </w:t>
+      </w:r>
+      <w:r>
+        <w:rPr>
+          <w:rFonts w:ascii="Consolas" w:hAnsi="Consolas" w:cs="Consolas"/>
+          <w:color w:val="B4235A"/>
+          <w:sz w:val="19"/>
+        </w:rPr>
+        <w:t xml:space="preserve">(</w:t>
+      </w:r>
+      <w:r>
+        <w:t xml:space="preserve">) вызовут ошибку 500, а сложный шаблон может долго выполняться. Доступно только менеджеру, поэтому риск низкий. Исправление: экранировать спецсимволы перед созданием RegExp.</w:t>
       </w:r>
     </w:p>
     <w:p>
@@ -22978,36 +23107,60 @@
         <w:ind w:left="400" w:hanging="300"/>
       </w:pPr>
       <w:r>
-        <w:t xml:space="preserve">7. </w:t>
+        <w:t xml:space="preserve">6. </w:t>
       </w:r>
       <w:r>
         <w:rPr>
           <w:b/>
-          <w:rFonts w:ascii="Consolas" w:hAnsi="Consolas" w:cs="Consolas"/>
-          <w:color w:val="B4235A"/>
-          <w:sz w:val="19"/>
-        </w:rPr>
-        <w:t xml:space="preserve">cors()</w:t>
-      </w:r>
-      <w:r>
-        <w:rPr>
-          <w:b/>
-        </w:rPr>
-        <w:t xml:space="preserve"> без настроек</w:t>
-      </w:r>
-      <w:r>
-        <w:t xml:space="preserve"> разрешает запросы с любого сайта. Для API с токенами в заголовке это не критично, но правильнее указать адрес своего фронта: </w:t>
-      </w:r>
-      <w:r>
-        <w:rPr>
-          <w:rFonts w:ascii="Consolas" w:hAnsi="Consolas" w:cs="Consolas"/>
-          <w:color w:val="B4235A"/>
-          <w:sz w:val="19"/>
-        </w:rPr>
-        <w:t xml:space="preserve">cors({ origin: CLIENT_URL })</w:t>
-      </w:r>
-      <w:r>
-        <w:t xml:space="preserve">.</w:t>
+        </w:rPr>
+        <w:t xml:space="preserve">Имя и комментарий покупателя вставляются в HTML письма без экранирования.</w:t>
+      </w:r>
+      <w:r>
+        <w:t xml:space="preserve"> Если в поле имени написать HTML-код, он попадёт в письмо менеджеру. Исправление: заменять </w:t>
+      </w:r>
+      <w:r>
+        <w:rPr>
+          <w:rFonts w:ascii="Consolas" w:hAnsi="Consolas" w:cs="Consolas"/>
+          <w:color w:val="B4235A"/>
+          <w:sz w:val="19"/>
+        </w:rPr>
+        <w:t xml:space="preserve">&lt;</w:t>
+      </w:r>
+      <w:r>
+        <w:t xml:space="preserve">, </w:t>
+      </w:r>
+      <w:r>
+        <w:rPr>
+          <w:rFonts w:ascii="Consolas" w:hAnsi="Consolas" w:cs="Consolas"/>
+          <w:color w:val="B4235A"/>
+          <w:sz w:val="19"/>
+        </w:rPr>
+        <w:t xml:space="preserve">&gt;</w:t>
+      </w:r>
+      <w:r>
+        <w:t xml:space="preserve">, </w:t>
+      </w:r>
+      <w:r>
+        <w:rPr>
+          <w:rFonts w:ascii="Consolas" w:hAnsi="Consolas" w:cs="Consolas"/>
+          <w:color w:val="B4235A"/>
+          <w:sz w:val="19"/>
+        </w:rPr>
+        <w:t xml:space="preserve">&amp;</w:t>
+      </w:r>
+      <w:r>
+        <w:t xml:space="preserve">, </w:t>
+      </w:r>
+      <w:r>
+        <w:rPr>
+          <w:rFonts w:ascii="Consolas" w:hAnsi="Consolas" w:cs="Consolas"/>
+          <w:color w:val="B4235A"/>
+          <w:sz w:val="19"/>
+        </w:rPr>
+        <w:t xml:space="preserve">"</w:t>
+      </w:r>
+      <w:r>
+        <w:t xml:space="preserve"> на HTML-сущности.</w:t>
       </w:r>
     </w:p>
     <w:p>
@@ -23016,46 +23169,33 @@
         <w:ind w:left="400" w:hanging="300"/>
       </w:pPr>
       <w:r>
-        <w:t xml:space="preserve">8. </w:t>
+        <w:t xml:space="preserve">7. </w:t>
       </w:r>
       <w:r>
         <w:rPr>
           <w:b/>
-        </w:rPr>
-        <w:t xml:space="preserve">Мелочи в комментариях и логах:</w:t>
-      </w:r>
-      <w:r>
-        <w:t xml:space="preserve"> в </w:t>
-      </w:r>
-      <w:r>
-        <w:rPr>
-          <w:rFonts w:ascii="Consolas" w:hAnsi="Consolas" w:cs="Consolas"/>
-          <w:color w:val="B4235A"/>
-          <w:sz w:val="19"/>
-        </w:rPr>
-        <w:t xml:space="preserve">authMiddleware.js</w:t>
-      </w:r>
-      <w:r>
-        <w:t xml:space="preserve"> комментарий говорит про «7 day token», хотя токен живёт 1 час; в </w:t>
-      </w:r>
-      <w:r>
-        <w:rPr>
-          <w:rFonts w:ascii="Consolas" w:hAnsi="Consolas" w:cs="Consolas"/>
-          <w:color w:val="B4235A"/>
-          <w:sz w:val="19"/>
-        </w:rPr>
-        <w:t xml:space="preserve">index.js</w:t>
-      </w:r>
-      <w:r>
-        <w:t xml:space="preserve"> сообщение о запуске всегда пишет «port 5000», даже если задан другой </w:t>
-      </w:r>
-      <w:r>
-        <w:rPr>
-          <w:rFonts w:ascii="Consolas" w:hAnsi="Consolas" w:cs="Consolas"/>
-          <w:color w:val="B4235A"/>
-          <w:sz w:val="19"/>
-        </w:rPr>
-        <w:t xml:space="preserve">PORT</w:t>
+          <w:rFonts w:ascii="Consolas" w:hAnsi="Consolas" w:cs="Consolas"/>
+          <w:color w:val="B4235A"/>
+          <w:sz w:val="19"/>
+        </w:rPr>
+        <w:t xml:space="preserve">cors()</w:t>
+      </w:r>
+      <w:r>
+        <w:rPr>
+          <w:b/>
+        </w:rPr>
+        <w:t xml:space="preserve"> без настроек</w:t>
+      </w:r>
+      <w:r>
+        <w:t xml:space="preserve"> разрешает запросы с любого сайта. Для API с токенами в заголовке это не критично, но правильнее указать адрес своего фронта: </w:t>
+      </w:r>
+      <w:r>
+        <w:rPr>
+          <w:rFonts w:ascii="Consolas" w:hAnsi="Consolas" w:cs="Consolas"/>
+          <w:color w:val="B4235A"/>
+          <w:sz w:val="19"/>
+        </w:rPr>
+        <w:t xml:space="preserve">cors({ origin: CLIENT_URL })</w:t>
       </w:r>
       <w:r>
         <w:t xml:space="preserve">.</w:t>
@@ -23067,7 +23207,7 @@
         <w:ind w:left="400" w:hanging="300"/>
       </w:pPr>
       <w:r>
-        <w:t xml:space="preserve">9. </w:t>
+        <w:t xml:space="preserve">8. </w:t>
       </w:r>
       <w:r>
         <w:rPr>
@@ -23085,28 +23225,2058 @@
         <w:ind w:left="400" w:hanging="300"/>
       </w:pPr>
       <w:r>
+        <w:t xml:space="preserve">9. </w:t>
+      </w:r>
+      <w:r>
+        <w:rPr>
+          <w:b/>
+        </w:rPr>
+        <w:t xml:space="preserve">Lock-файлы расходятся с </w:t>
+      </w:r>
+      <w:r>
+        <w:rPr>
+          <w:b/>
+          <w:rFonts w:ascii="Consolas" w:hAnsi="Consolas" w:cs="Consolas"/>
+          <w:color w:val="B4235A"/>
+          <w:sz w:val="19"/>
+        </w:rPr>
+        <w:t xml:space="preserve">package.json</w:t>
+      </w:r>
+      <w:r>
+        <w:rPr>
+          <w:b/>
+        </w:rPr>
+        <w:t xml:space="preserve">.</w:t>
+      </w:r>
+      <w:r>
+        <w:t xml:space="preserve"> Команда </w:t>
+      </w:r>
+      <w:r>
+        <w:rPr>
+          <w:rFonts w:ascii="Consolas" w:hAnsi="Consolas" w:cs="Consolas"/>
+          <w:color w:val="B4235A"/>
+          <w:sz w:val="19"/>
+        </w:rPr>
+        <w:t xml:space="preserve">npm ci</w:t>
+      </w:r>
+      <w:r>
+        <w:t xml:space="preserve"> (строгая установка) на них падает, </w:t>
+      </w:r>
+      <w:r>
+        <w:rPr>
+          <w:rFonts w:ascii="Consolas" w:hAnsi="Consolas" w:cs="Consolas"/>
+          <w:color w:val="B4235A"/>
+          <w:sz w:val="19"/>
+        </w:rPr>
+        <w:t xml:space="preserve">npm install</w:t>
+      </w:r>
+      <w:r>
+        <w:t xml:space="preserve"> работает. Исправление: один раз выполнить </w:t>
+      </w:r>
+      <w:r>
+        <w:rPr>
+          <w:rFonts w:ascii="Consolas" w:hAnsi="Consolas" w:cs="Consolas"/>
+          <w:color w:val="B4235A"/>
+          <w:sz w:val="19"/>
+        </w:rPr>
+        <w:t xml:space="preserve">npm install</w:t>
+      </w:r>
+      <w:r>
+        <w:t xml:space="preserve"> в </w:t>
+      </w:r>
+      <w:r>
+        <w:rPr>
+          <w:rFonts w:ascii="Consolas" w:hAnsi="Consolas" w:cs="Consolas"/>
+          <w:color w:val="B4235A"/>
+          <w:sz w:val="19"/>
+        </w:rPr>
+        <w:t xml:space="preserve">back</w:t>
+      </w:r>
+      <w:r>
+        <w:t xml:space="preserve"> и </w:t>
+      </w:r>
+      <w:r>
+        <w:rPr>
+          <w:rFonts w:ascii="Consolas" w:hAnsi="Consolas" w:cs="Consolas"/>
+          <w:color w:val="B4235A"/>
+          <w:sz w:val="19"/>
+        </w:rPr>
+        <w:t xml:space="preserve">front</w:t>
+      </w:r>
+      <w:r>
+        <w:t xml:space="preserve"> и закоммитить обновлённые </w:t>
+      </w:r>
+      <w:r>
+        <w:rPr>
+          <w:rFonts w:ascii="Consolas" w:hAnsi="Consolas" w:cs="Consolas"/>
+          <w:color w:val="B4235A"/>
+          <w:sz w:val="19"/>
+        </w:rPr>
+        <w:t xml:space="preserve">package-lock.json</w:t>
+      </w:r>
+      <w:r>
+        <w:t xml:space="preserve">.</w:t>
+      </w:r>
+    </w:p>
+    <w:p>
+      <w:pPr>
+        <w:spacing w:after="60"/>
+        <w:ind w:left="400" w:hanging="300"/>
+      </w:pPr>
+      <w:r>
         <w:t xml:space="preserve">10. </w:t>
       </w:r>
       <w:r>
         <w:rPr>
           <w:b/>
         </w:rPr>
-        <w:t xml:space="preserve">Оплата на опубликованном сервере не работает без ключа Stripe</w:t>
-      </w:r>
-      <w:r>
-        <w:t xml:space="preserve"> — ответ </w:t>
-      </w:r>
-      <w:r>
-        <w:rPr>
-          <w:rFonts w:ascii="Consolas" w:hAnsi="Consolas" w:cs="Consolas"/>
-          <w:color w:val="B4235A"/>
-          <w:sz w:val="19"/>
-        </w:rPr>
-        <w:t xml:space="preserve">501 Payments are not configured</w:t>
-      </w:r>
-      <w:r>
-        <w:t xml:space="preserve">. Код рабочий при наличии ключей.</w:t>
-      </w:r>
+        <w:t xml:space="preserve">Линтер находит старые замечания</w:t>
+      </w:r>
+      <w:r>
+        <w:t xml:space="preserve"> — неиспользуемый </w:t>
+      </w:r>
+      <w:r>
+        <w:rPr>
+          <w:rFonts w:ascii="Consolas" w:hAnsi="Consolas" w:cs="Consolas"/>
+          <w:color w:val="B4235A"/>
+          <w:sz w:val="19"/>
+        </w:rPr>
+        <w:t xml:space="preserve">import React</w:t>
+      </w:r>
+      <w:r>
+        <w:t xml:space="preserve"> и вызовы </w:t>
+      </w:r>
+      <w:r>
+        <w:rPr>
+          <w:rFonts w:ascii="Consolas" w:hAnsi="Consolas" w:cs="Consolas"/>
+          <w:color w:val="B4235A"/>
+          <w:sz w:val="19"/>
+        </w:rPr>
+        <w:t xml:space="preserve">setState</w:t>
+      </w:r>
+      <w:r>
+        <w:t xml:space="preserve"> прямо внутри </w:t>
+      </w:r>
+      <w:r>
+        <w:rPr>
+          <w:rFonts w:ascii="Consolas" w:hAnsi="Consolas" w:cs="Consolas"/>
+          <w:color w:val="B4235A"/>
+          <w:sz w:val="19"/>
+        </w:rPr>
+        <w:t xml:space="preserve">useEffect</w:t>
+      </w:r>
+      <w:r>
+        <w:t xml:space="preserve">. На работу сайта не влияют, сборка проходит.</w:t>
+      </w:r>
+    </w:p>
+    <w:p>
+      <w:pPr>
+        <w:pStyle w:val="Heading1"/>
+        <w:pageBreakBefore/>
+      </w:pPr>
+      <w:r>
+        <w:t xml:space="preserve">Часть 8. Как сайт попадает в интернет и как подключена оплата</w:t>
+      </w:r>
+    </w:p>
+    <w:p>
+      <w:pPr>
+        <w:pStyle w:val="Heading2"/>
+      </w:pPr>
+      <w:r>
+        <w:t xml:space="preserve">8.1 Деплой: GitHub → Render</w:t>
+      </w:r>
+    </w:p>
+    <w:p>
+      <w:pPr>
+        <w:pStyle w:val="CodeBlock"/>
+        <w:keepNext/>
+        <w:spacing w:before="80" w:after="0"/>
+      </w:pPr>
+      <w:r>
+        <w:t xml:space="preserve">твой компьютер ──git push──▶ GitHub (KostyVlad/DarinsHandMade, ветка main)</w:t>
+      </w:r>
+    </w:p>
+    <w:p>
+      <w:pPr>
+        <w:pStyle w:val="CodeBlock"/>
+        <w:keepNext/>
+        <w:spacing w:before="0" w:after="0"/>
+      </w:pPr>
+      <w:r>
+        <w:t xml:space="preserve">                                   │  Render замечает новый коммит</w:t>
+      </w:r>
+    </w:p>
+    <w:p>
+      <w:pPr>
+        <w:pStyle w:val="CodeBlock"/>
+        <w:keepNext/>
+        <w:spacing w:before="0" w:after="0"/>
+      </w:pPr>
+      <w:r>
+        <w:t xml:space="preserve">                                   ▼</w:t>
+      </w:r>
+    </w:p>
+    <w:p>
+      <w:pPr>
+        <w:pStyle w:val="CodeBlock"/>
+        <w:keepNext/>
+        <w:spacing w:before="0" w:after="0"/>
+      </w:pPr>
+      <w:r>
+        <w:t xml:space="preserve">             ┌─────────────────────┴─────────────────────┐</w:t>
+      </w:r>
+    </w:p>
+    <w:p>
+      <w:pPr>
+        <w:pStyle w:val="CodeBlock"/>
+        <w:keepNext/>
+        <w:spacing w:before="0" w:after="0"/>
+      </w:pPr>
+      <w:r>
+        <w:t xml:space="preserve">             ▼                                           ▼</w:t>
+      </w:r>
+    </w:p>
+    <w:p>
+      <w:pPr>
+        <w:pStyle w:val="CodeBlock"/>
+        <w:keepNext/>
+        <w:spacing w:before="0" w:after="0"/>
+      </w:pPr>
+      <w:r>
+        <w:t xml:space="preserve"> darinshandmade-front.onrender.com          darinshandmade.onrender.com</w:t>
+      </w:r>
+    </w:p>
+    <w:p>
+      <w:pPr>
+        <w:pStyle w:val="CodeBlock"/>
+        <w:spacing w:before="0" w:after="160"/>
+      </w:pPr>
+      <w:r>
+        <w:t xml:space="preserve"> фронт: npm run build → готовые файлы        сервер: node index.js</w:t>
+      </w:r>
+    </w:p>
+    <w:p>
+      <w:pPr>
+        <w:spacing w:after="60"/>
+        <w:ind w:left="360" w:hanging="260"/>
+      </w:pPr>
+      <w:r>
+        <w:t xml:space="preserve">•  </w:t>
+      </w:r>
+      <w:r>
+        <w:t xml:space="preserve">Код хранится на GitHub. Render подключён к репозиторию и после каждого </w:t>
+      </w:r>
+      <w:r>
+        <w:rPr>
+          <w:rFonts w:ascii="Consolas" w:hAnsi="Consolas" w:cs="Consolas"/>
+          <w:color w:val="B4235A"/>
+          <w:sz w:val="19"/>
+        </w:rPr>
+        <w:t xml:space="preserve">git push</w:t>
+      </w:r>
+      <w:r>
+        <w:t xml:space="preserve"> в ветку </w:t>
+      </w:r>
+      <w:r>
+        <w:rPr>
+          <w:rFonts w:ascii="Consolas" w:hAnsi="Consolas" w:cs="Consolas"/>
+          <w:color w:val="B4235A"/>
+          <w:sz w:val="19"/>
+        </w:rPr>
+        <w:t xml:space="preserve">main</w:t>
+      </w:r>
+      <w:r>
+        <w:t xml:space="preserve"> </w:t>
+      </w:r>
+      <w:r>
+        <w:rPr>
+          <w:b/>
+        </w:rPr>
+        <w:t xml:space="preserve">сам</w:t>
+      </w:r>
+      <w:r>
+        <w:t xml:space="preserve"> скачивает код и пересобирает оба сервиса. Делать ничего не нужно, пересборка занимает несколько минут.</w:t>
+      </w:r>
+    </w:p>
+    <w:p>
+      <w:pPr>
+        <w:spacing w:after="60"/>
+        <w:ind w:left="360" w:hanging="260"/>
+      </w:pPr>
+      <w:r>
+        <w:t xml:space="preserve">•  </w:t>
+      </w:r>
+      <w:r>
+        <w:t xml:space="preserve">Фронт и сервер — </w:t>
+      </w:r>
+      <w:r>
+        <w:rPr>
+          <w:b/>
+        </w:rPr>
+        <w:t xml:space="preserve">два отдельных сервиса</w:t>
+      </w:r>
+      <w:r>
+        <w:t xml:space="preserve"> на Render со своими адресами. Поэтому в </w:t>
+      </w:r>
+      <w:r>
+        <w:rPr>
+          <w:rFonts w:ascii="Consolas" w:hAnsi="Consolas" w:cs="Consolas"/>
+          <w:color w:val="B4235A"/>
+          <w:sz w:val="19"/>
+        </w:rPr>
+        <w:t xml:space="preserve">api.jsx</w:t>
+      </w:r>
+      <w:r>
+        <w:t xml:space="preserve"> записан адрес сервера, а на сервере включён </w:t>
+      </w:r>
+      <w:r>
+        <w:rPr>
+          <w:rFonts w:ascii="Consolas" w:hAnsi="Consolas" w:cs="Consolas"/>
+          <w:color w:val="B4235A"/>
+          <w:sz w:val="19"/>
+        </w:rPr>
+        <w:t xml:space="preserve">cors()</w:t>
+      </w:r>
+      <w:r>
+        <w:t xml:space="preserve">.</w:t>
+      </w:r>
+    </w:p>
+    <w:p>
+      <w:pPr>
+        <w:spacing w:after="60"/>
+        <w:ind w:left="360" w:hanging="260"/>
+      </w:pPr>
+      <w:r>
+        <w:t xml:space="preserve">•  </w:t>
+      </w:r>
+      <w:r>
+        <w:t xml:space="preserve">Секреты (</w:t>
+      </w:r>
+      <w:r>
+        <w:rPr>
+          <w:rFonts w:ascii="Consolas" w:hAnsi="Consolas" w:cs="Consolas"/>
+          <w:color w:val="B4235A"/>
+          <w:sz w:val="19"/>
+        </w:rPr>
+        <w:t xml:space="preserve">MONGO_URI</w:t>
+      </w:r>
+      <w:r>
+        <w:t xml:space="preserve">, </w:t>
+      </w:r>
+      <w:r>
+        <w:rPr>
+          <w:rFonts w:ascii="Consolas" w:hAnsi="Consolas" w:cs="Consolas"/>
+          <w:color w:val="B4235A"/>
+          <w:sz w:val="19"/>
+        </w:rPr>
+        <w:t xml:space="preserve">JWT_SECRET</w:t>
+      </w:r>
+      <w:r>
+        <w:t xml:space="preserve">, ключи Stripe и Resend) хранятся не в git, а в Render → сервис → </w:t>
+      </w:r>
+      <w:r>
+        <w:rPr>
+          <w:b/>
+        </w:rPr>
+        <w:t xml:space="preserve">Environment</w:t>
+      </w:r>
+      <w:r>
+        <w:t xml:space="preserve">. Для сервера это то же самое, что файл </w:t>
+      </w:r>
+      <w:r>
+        <w:rPr>
+          <w:rFonts w:ascii="Consolas" w:hAnsi="Consolas" w:cs="Consolas"/>
+          <w:color w:val="B4235A"/>
+          <w:sz w:val="19"/>
+        </w:rPr>
+        <w:t xml:space="preserve">.env</w:t>
+      </w:r>
+      <w:r>
+        <w:t xml:space="preserve"> на твоём компьютере: Render кладёт их в </w:t>
+      </w:r>
+      <w:r>
+        <w:rPr>
+          <w:rFonts w:ascii="Consolas" w:hAnsi="Consolas" w:cs="Consolas"/>
+          <w:color w:val="B4235A"/>
+          <w:sz w:val="19"/>
+        </w:rPr>
+        <w:t xml:space="preserve">process.env</w:t>
+      </w:r>
+      <w:r>
+        <w:t xml:space="preserve">.</w:t>
+      </w:r>
+    </w:p>
+    <w:p>
+      <w:pPr>
+        <w:spacing w:after="60"/>
+        <w:ind w:left="360" w:hanging="260"/>
+      </w:pPr>
+      <w:r>
+        <w:t xml:space="preserve">•  </w:t>
+      </w:r>
+      <w:r>
+        <w:t xml:space="preserve">На бесплатном тарифе сервер «засыпает» после простоя. Первый запрос после перерыва ждёт около 30 секунд, пока сервер проснётся. На защите стоит открыть сайт заранее.</w:t>
+      </w:r>
+    </w:p>
+    <w:p>
+      <w:r>
+        <w:rPr>
+          <w:b/>
+        </w:rPr>
+        <w:t xml:space="preserve">Как проверить, что новая версия доехала:</w:t>
+      </w:r>
+      <w:r>
+        <w:t xml:space="preserve"> запросить адрес, которого раньше не было. Например </w:t>
+      </w:r>
+      <w:r>
+        <w:rPr>
+          <w:rFonts w:ascii="Consolas" w:hAnsi="Consolas" w:cs="Consolas"/>
+          <w:color w:val="B4235A"/>
+          <w:sz w:val="19"/>
+        </w:rPr>
+        <w:t xml:space="preserve">DELETE /api/cart</w:t>
+      </w:r>
+      <w:r>
+        <w:t xml:space="preserve"> до деплоя отвечал </w:t>
+      </w:r>
+      <w:r>
+        <w:rPr>
+          <w:rFonts w:ascii="Consolas" w:hAnsi="Consolas" w:cs="Consolas"/>
+          <w:color w:val="B4235A"/>
+          <w:sz w:val="19"/>
+        </w:rPr>
+        <w:t xml:space="preserve">404</w:t>
+      </w:r>
+      <w:r>
+        <w:t xml:space="preserve"> (адреса нет), после — </w:t>
+      </w:r>
+      <w:r>
+        <w:rPr>
+          <w:rFonts w:ascii="Consolas" w:hAnsi="Consolas" w:cs="Consolas"/>
+          <w:color w:val="B4235A"/>
+          <w:sz w:val="19"/>
+        </w:rPr>
+        <w:t xml:space="preserve">401</w:t>
+      </w:r>
+      <w:r>
+        <w:t xml:space="preserve"> (адрес есть, но нужен токен).</w:t>
+      </w:r>
+    </w:p>
+    <w:p>
+      <w:pPr>
+        <w:pStyle w:val="Heading2"/>
+      </w:pPr>
+      <w:r>
+        <w:t xml:space="preserve">8.2 Оплата через Stripe</w:t>
+      </w:r>
+    </w:p>
+    <w:p>
+      <w:r>
+        <w:rPr>
+          <w:b/>
+        </w:rPr>
+        <w:t xml:space="preserve">Stripe Checkout</w:t>
+      </w:r>
+      <w:r>
+        <w:t xml:space="preserve"> — страница оплаты, которую показывает сам Stripe, а не наш сайт. Наш сервер только создаёт «сессию оплаты» и отправляет покупателя по ссылке. Главный плюс: </w:t>
+      </w:r>
+      <w:r>
+        <w:rPr>
+          <w:b/>
+        </w:rPr>
+        <w:t xml:space="preserve">данные карты никогда не попадают на наш сервер</w:t>
+      </w:r>
+      <w:r>
+        <w:t xml:space="preserve">, их видит только Stripe. Поэтому нам не нужно выполнять строгие требования к хранению карт (стандарт PCI DSS).</w:t>
+      </w:r>
+    </w:p>
+    <w:p>
+      <w:pPr>
+        <w:pStyle w:val="Heading3"/>
+      </w:pPr>
+      <w:r>
+        <w:t xml:space="preserve">Что настроено</w:t>
+      </w:r>
+    </w:p>
+    <w:tbl>
+      <w:tblPr>
+        <w:tblW w:w="5000" w:type="pct"/>
+        <w:tblBorders>
+          <w:top w:val="single" w:sz="4" w:color="BBBBBB"/>
+          <w:left w:val="single" w:sz="4" w:color="BBBBBB"/>
+          <w:bottom w:val="single" w:sz="4" w:color="BBBBBB"/>
+          <w:right w:val="single" w:sz="4" w:color="BBBBBB"/>
+          <w:insideH w:val="single" w:sz="4" w:color="BBBBBB"/>
+          <w:insideV w:val="single" w:sz="4" w:color="BBBBBB"/>
+        </w:tblBorders>
+        <w:tblCellMar>
+          <w:left w:w="80" w:type="dxa"/>
+          <w:right w:w="80" w:type="dxa"/>
+        </w:tblCellMar>
+      </w:tblPr>
+      <w:tblGrid>
+        <w:gridCol w:w="3200"/>
+        <w:gridCol w:w="3200"/>
+        <w:gridCol w:w="3200"/>
+      </w:tblGrid>
+      <w:tr>
+        <w:trPr>
+          <w:tblHeader/>
+          <w:cantSplit/>
+        </w:trPr>
+        <w:tc>
+          <w:tcPr>
+            <w:tcW w:w="3200" w:type="dxa"/>
+            <w:shd w:val="clear" w:color="auto" w:fill="222222"/>
+          </w:tcPr>
+          <w:p>
+            <w:pPr>
+              <w:spacing w:before="20" w:after="20"/>
+            </w:pPr>
+            <w:r>
+              <w:rPr>
+                <w:b/>
+                <w:color w:val="FFFFFF"/>
+                <w:sz w:val="19"/>
+              </w:rPr>
+              <w:t xml:space="preserve">Где</w:t>
+            </w:r>
+          </w:p>
+        </w:tc>
+        <w:tc>
+          <w:tcPr>
+            <w:tcW w:w="3200" w:type="dxa"/>
+            <w:shd w:val="clear" w:color="auto" w:fill="222222"/>
+          </w:tcPr>
+          <w:p>
+            <w:pPr>
+              <w:spacing w:before="20" w:after="20"/>
+            </w:pPr>
+            <w:r>
+              <w:rPr>
+                <w:b/>
+                <w:color w:val="FFFFFF"/>
+                <w:sz w:val="19"/>
+              </w:rPr>
+              <w:t xml:space="preserve">Что</w:t>
+            </w:r>
+          </w:p>
+        </w:tc>
+        <w:tc>
+          <w:tcPr>
+            <w:tcW w:w="3200" w:type="dxa"/>
+            <w:shd w:val="clear" w:color="auto" w:fill="222222"/>
+          </w:tcPr>
+          <w:p>
+            <w:pPr>
+              <w:spacing w:before="20" w:after="20"/>
+            </w:pPr>
+            <w:r>
+              <w:rPr>
+                <w:b/>
+                <w:color w:val="FFFFFF"/>
+                <w:sz w:val="19"/>
+              </w:rPr>
+              <w:t xml:space="preserve">Зачем</w:t>
+            </w:r>
+          </w:p>
+        </w:tc>
+      </w:tr>
+      <w:tr>
+        <w:trPr>
+          <w:cantSplit/>
+        </w:trPr>
+        <w:tc>
+          <w:tcPr>
+            <w:tcW w:w="3200" w:type="dxa"/>
+          </w:tcPr>
+          <w:p>
+            <w:pPr>
+              <w:spacing w:before="20" w:after="20"/>
+            </w:pPr>
+            <w:r>
+              <w:rPr>
+                <w:sz w:val="19"/>
+              </w:rPr>
+              <w:t xml:space="preserve">Stripe → Developers → API keys</w:t>
+            </w:r>
+          </w:p>
+        </w:tc>
+        <w:tc>
+          <w:tcPr>
+            <w:tcW w:w="3200" w:type="dxa"/>
+          </w:tcPr>
+          <w:p>
+            <w:pPr>
+              <w:spacing w:before="20" w:after="20"/>
+            </w:pPr>
+            <w:r>
+              <w:rPr>
+                <w:sz w:val="19"/>
+              </w:rPr>
+              <w:t xml:space="preserve">Secret key </w:t>
+            </w:r>
+            <w:r>
+              <w:rPr>
+                <w:rFonts w:ascii="Consolas" w:hAnsi="Consolas" w:cs="Consolas"/>
+                <w:color w:val="B4235A"/>
+                <w:sz w:val="19"/>
+              </w:rPr>
+              <w:t xml:space="preserve">sk_test_...</w:t>
+            </w:r>
+          </w:p>
+        </w:tc>
+        <w:tc>
+          <w:tcPr>
+            <w:tcW w:w="3200" w:type="dxa"/>
+          </w:tcPr>
+          <w:p>
+            <w:pPr>
+              <w:spacing w:before="20" w:after="20"/>
+            </w:pPr>
+            <w:r>
+              <w:rPr>
+                <w:sz w:val="19"/>
+              </w:rPr>
+              <w:t xml:space="preserve">сервер создаёт сессии оплаты (</w:t>
+            </w:r>
+            <w:r>
+              <w:rPr>
+                <w:rFonts w:ascii="Consolas" w:hAnsi="Consolas" w:cs="Consolas"/>
+                <w:color w:val="B4235A"/>
+                <w:sz w:val="19"/>
+              </w:rPr>
+              <w:t xml:space="preserve">stripe.checkout.sessions.create</w:t>
+            </w:r>
+            <w:r>
+              <w:rPr>
+                <w:sz w:val="19"/>
+              </w:rPr>
+              <w:t xml:space="preserve">)</w:t>
+            </w:r>
+          </w:p>
+        </w:tc>
+      </w:tr>
+      <w:tr>
+        <w:trPr>
+          <w:cantSplit/>
+        </w:trPr>
+        <w:tc>
+          <w:tcPr>
+            <w:tcW w:w="3200" w:type="dxa"/>
+          </w:tcPr>
+          <w:p>
+            <w:pPr>
+              <w:spacing w:before="20" w:after="20"/>
+            </w:pPr>
+            <w:r>
+              <w:rPr>
+                <w:sz w:val="19"/>
+              </w:rPr>
+              <w:t xml:space="preserve">Stripe → Developers → Webhooks</w:t>
+            </w:r>
+          </w:p>
+        </w:tc>
+        <w:tc>
+          <w:tcPr>
+            <w:tcW w:w="3200" w:type="dxa"/>
+          </w:tcPr>
+          <w:p>
+            <w:pPr>
+              <w:spacing w:before="20" w:after="20"/>
+            </w:pPr>
+            <w:r>
+              <w:rPr>
+                <w:sz w:val="19"/>
+              </w:rPr>
+              <w:t xml:space="preserve">адрес </w:t>
+            </w:r>
+            <w:r>
+              <w:rPr>
+                <w:rFonts w:ascii="Consolas" w:hAnsi="Consolas" w:cs="Consolas"/>
+                <w:color w:val="B4235A"/>
+                <w:sz w:val="19"/>
+              </w:rPr>
+              <w:t xml:space="preserve">https://darinshandmade.onrender.com/api/orders/webhook</w:t>
+            </w:r>
+            <w:r>
+              <w:rPr>
+                <w:sz w:val="19"/>
+              </w:rPr>
+              <w:t xml:space="preserve">, событие </w:t>
+            </w:r>
+            <w:r>
+              <w:rPr>
+                <w:rFonts w:ascii="Consolas" w:hAnsi="Consolas" w:cs="Consolas"/>
+                <w:color w:val="B4235A"/>
+                <w:sz w:val="19"/>
+              </w:rPr>
+              <w:t xml:space="preserve">checkout.session.completed</w:t>
+            </w:r>
+            <w:r>
+              <w:rPr>
+                <w:sz w:val="19"/>
+              </w:rPr>
+              <w:t xml:space="preserve">, тип Snapshot</w:t>
+            </w:r>
+          </w:p>
+        </w:tc>
+        <w:tc>
+          <w:tcPr>
+            <w:tcW w:w="3200" w:type="dxa"/>
+          </w:tcPr>
+          <w:p>
+            <w:pPr>
+              <w:spacing w:before="20" w:after="20"/>
+            </w:pPr>
+            <w:r>
+              <w:rPr>
+                <w:sz w:val="19"/>
+              </w:rPr>
+              <w:t xml:space="preserve">Stripe сообщает серверу, что заказ оплачен</w:t>
+            </w:r>
+          </w:p>
+        </w:tc>
+      </w:tr>
+      <w:tr>
+        <w:trPr>
+          <w:cantSplit/>
+        </w:trPr>
+        <w:tc>
+          <w:tcPr>
+            <w:tcW w:w="3200" w:type="dxa"/>
+          </w:tcPr>
+          <w:p>
+            <w:pPr>
+              <w:spacing w:before="20" w:after="20"/>
+            </w:pPr>
+            <w:r>
+              <w:rPr>
+                <w:sz w:val="19"/>
+              </w:rPr>
+              <w:t xml:space="preserve">Там же</w:t>
+            </w:r>
+          </w:p>
+        </w:tc>
+        <w:tc>
+          <w:tcPr>
+            <w:tcW w:w="3200" w:type="dxa"/>
+          </w:tcPr>
+          <w:p>
+            <w:pPr>
+              <w:spacing w:before="20" w:after="20"/>
+            </w:pPr>
+            <w:r>
+              <w:rPr>
+                <w:sz w:val="19"/>
+              </w:rPr>
+              <w:t xml:space="preserve">Signing secret </w:t>
+            </w:r>
+            <w:r>
+              <w:rPr>
+                <w:rFonts w:ascii="Consolas" w:hAnsi="Consolas" w:cs="Consolas"/>
+                <w:color w:val="B4235A"/>
+                <w:sz w:val="19"/>
+              </w:rPr>
+              <w:t xml:space="preserve">whsec_...</w:t>
+            </w:r>
+          </w:p>
+        </w:tc>
+        <w:tc>
+          <w:tcPr>
+            <w:tcW w:w="3200" w:type="dxa"/>
+          </w:tcPr>
+          <w:p>
+            <w:pPr>
+              <w:spacing w:before="20" w:after="20"/>
+            </w:pPr>
+            <w:r>
+              <w:rPr>
+                <w:sz w:val="19"/>
+              </w:rPr>
+              <w:t xml:space="preserve">сервер проверяет, что вебхук прислал именно Stripe (</w:t>
+            </w:r>
+            <w:r>
+              <w:rPr>
+                <w:rFonts w:ascii="Consolas" w:hAnsi="Consolas" w:cs="Consolas"/>
+                <w:color w:val="B4235A"/>
+                <w:sz w:val="19"/>
+              </w:rPr>
+              <w:t xml:space="preserve">constructEvent</w:t>
+            </w:r>
+            <w:r>
+              <w:rPr>
+                <w:sz w:val="19"/>
+              </w:rPr>
+              <w:t xml:space="preserve">)</w:t>
+            </w:r>
+          </w:p>
+        </w:tc>
+      </w:tr>
+      <w:tr>
+        <w:trPr>
+          <w:cantSplit/>
+        </w:trPr>
+        <w:tc>
+          <w:tcPr>
+            <w:tcW w:w="3200" w:type="dxa"/>
+          </w:tcPr>
+          <w:p>
+            <w:pPr>
+              <w:spacing w:before="20" w:after="20"/>
+            </w:pPr>
+            <w:r>
+              <w:rPr>
+                <w:sz w:val="19"/>
+              </w:rPr>
+              <w:t xml:space="preserve">Render → бэкенд → Environment</w:t>
+            </w:r>
+          </w:p>
+        </w:tc>
+        <w:tc>
+          <w:tcPr>
+            <w:tcW w:w="3200" w:type="dxa"/>
+          </w:tcPr>
+          <w:p>
+            <w:pPr>
+              <w:spacing w:before="20" w:after="20"/>
+            </w:pPr>
+            <w:r>
+              <w:rPr>
+                <w:rFonts w:ascii="Consolas" w:hAnsi="Consolas" w:cs="Consolas"/>
+                <w:color w:val="B4235A"/>
+                <w:sz w:val="19"/>
+              </w:rPr>
+              <w:t xml:space="preserve">STRIPE_SECRET_KEY</w:t>
+            </w:r>
+            <w:r>
+              <w:rPr>
+                <w:sz w:val="19"/>
+              </w:rPr>
+              <w:t xml:space="preserve">, </w:t>
+            </w:r>
+            <w:r>
+              <w:rPr>
+                <w:rFonts w:ascii="Consolas" w:hAnsi="Consolas" w:cs="Consolas"/>
+                <w:color w:val="B4235A"/>
+                <w:sz w:val="19"/>
+              </w:rPr>
+              <w:t xml:space="preserve">STRIPE_WEBHOOK_SECRET</w:t>
+            </w:r>
+            <w:r>
+              <w:rPr>
+                <w:sz w:val="19"/>
+              </w:rPr>
+              <w:t xml:space="preserve">, </w:t>
+            </w:r>
+            <w:r>
+              <w:rPr>
+                <w:rFonts w:ascii="Consolas" w:hAnsi="Consolas" w:cs="Consolas"/>
+                <w:color w:val="B4235A"/>
+                <w:sz w:val="19"/>
+              </w:rPr>
+              <w:t xml:space="preserve">CLIENT_URL</w:t>
+            </w:r>
+          </w:p>
+        </w:tc>
+        <w:tc>
+          <w:tcPr>
+            <w:tcW w:w="3200" w:type="dxa"/>
+          </w:tcPr>
+          <w:p>
+            <w:pPr>
+              <w:spacing w:before="20" w:after="20"/>
+            </w:pPr>
+            <w:r>
+              <w:rPr>
+                <w:sz w:val="19"/>
+              </w:rPr>
+              <w:t xml:space="preserve">сервер читает ключи из </w:t>
+            </w:r>
+            <w:r>
+              <w:rPr>
+                <w:rFonts w:ascii="Consolas" w:hAnsi="Consolas" w:cs="Consolas"/>
+                <w:color w:val="B4235A"/>
+                <w:sz w:val="19"/>
+              </w:rPr>
+              <w:t xml:space="preserve">process.env</w:t>
+            </w:r>
+          </w:p>
+        </w:tc>
+      </w:tr>
+    </w:tbl>
+    <w:p>
+      <w:pPr>
+        <w:spacing w:after="60"/>
+      </w:pPr>
+    </w:p>
+    <w:p>
+      <w:pPr>
+        <w:spacing w:after="60"/>
+        <w:ind w:left="360" w:hanging="260"/>
+      </w:pPr>
+      <w:r>
+        <w:t xml:space="preserve">•  </w:t>
+      </w:r>
+      <w:r>
+        <w:rPr>
+          <w:b/>
+        </w:rPr>
+        <w:t xml:space="preserve">Publishable key</w:t>
+      </w:r>
+      <w:r>
+        <w:t xml:space="preserve"> (</w:t>
+      </w:r>
+      <w:r>
+        <w:rPr>
+          <w:rFonts w:ascii="Consolas" w:hAnsi="Consolas" w:cs="Consolas"/>
+          <w:color w:val="B4235A"/>
+          <w:sz w:val="19"/>
+        </w:rPr>
+        <w:t xml:space="preserve">pk_test_...</w:t>
+      </w:r>
+      <w:r>
+        <w:t xml:space="preserve">) не нужен: он нужен, только когда форма карты рисуется на нашем сайте, а у нас её рисует Stripe.</w:t>
+      </w:r>
+    </w:p>
+    <w:p>
+      <w:pPr>
+        <w:spacing w:after="60"/>
+        <w:ind w:left="360" w:hanging="260"/>
+      </w:pPr>
+      <w:r>
+        <w:t xml:space="preserve">•  </w:t>
+      </w:r>
+      <w:r>
+        <w:rPr>
+          <w:b/>
+        </w:rPr>
+        <w:t xml:space="preserve">Snapshot, а не Thin:</w:t>
+      </w:r>
+      <w:r>
+        <w:t xml:space="preserve"> в Snapshot событие содержит всю сессию оплаты, вместе с </w:t>
+      </w:r>
+      <w:r>
+        <w:rPr>
+          <w:rFonts w:ascii="Consolas" w:hAnsi="Consolas" w:cs="Consolas"/>
+          <w:color w:val="B4235A"/>
+          <w:sz w:val="19"/>
+        </w:rPr>
+        <w:t xml:space="preserve">metadata.orderId</w:t>
+      </w:r>
+      <w:r>
+        <w:t xml:space="preserve">, по которому сервер находит заказ. В Thin пришёл бы только id, и пришлось бы делать ещё один запрос в Stripe.</w:t>
+      </w:r>
+    </w:p>
+    <w:p>
+      <w:pPr>
+        <w:spacing w:after="60"/>
+        <w:ind w:left="360" w:hanging="260"/>
+      </w:pPr>
+      <w:r>
+        <w:t xml:space="preserve">•  </w:t>
+      </w:r>
+      <w:r>
+        <w:rPr>
+          <w:b/>
+        </w:rPr>
+        <w:t xml:space="preserve">Тестовый режим (Sandbox):</w:t>
+      </w:r>
+      <w:r>
+        <w:t xml:space="preserve"> настоящие деньги не списываются. Тестовая карта — </w:t>
+      </w:r>
+      <w:r>
+        <w:rPr>
+          <w:rFonts w:ascii="Consolas" w:hAnsi="Consolas" w:cs="Consolas"/>
+          <w:color w:val="B4235A"/>
+          <w:sz w:val="19"/>
+        </w:rPr>
+        <w:t xml:space="preserve">4242 4242 4242 4242</w:t>
+      </w:r>
+      <w:r>
+        <w:t xml:space="preserve">, любая будущая дата, любой CVC.</w:t>
+      </w:r>
+    </w:p>
+    <w:p>
+      <w:pPr>
+        <w:spacing w:after="60"/>
+        <w:ind w:left="360" w:hanging="260"/>
+      </w:pPr>
+      <w:r>
+        <w:t xml:space="preserve">•  </w:t>
+      </w:r>
+      <w:r>
+        <w:rPr>
+          <w:b/>
+        </w:rPr>
+        <w:t xml:space="preserve">Цена в шекелях.</w:t>
+      </w:r>
+      <w:r>
+        <w:t xml:space="preserve"> Stripe видит, что покупатель из Израиля, и сам предлагает оплатить в шекелях по текущему курсу. Наш код об этом не знает: сессия создаётся в долларах (</w:t>
+      </w:r>
+      <w:r>
+        <w:rPr>
+          <w:rFonts w:ascii="Consolas" w:hAnsi="Consolas" w:cs="Consolas"/>
+          <w:color w:val="B4235A"/>
+          <w:sz w:val="19"/>
+        </w:rPr>
+        <w:t xml:space="preserve">currency: 'usd'</w:t>
+      </w:r>
+      <w:r>
+        <w:t xml:space="preserve">), и в базе заказ хранится в долларах.</w:t>
+      </w:r>
+    </w:p>
+    <w:p>
+      <w:pPr>
+        <w:pStyle w:val="Heading3"/>
+      </w:pPr>
+      <w:r>
+        <w:t xml:space="preserve">Как понять по ответам сервера, что всё подключено</w:t>
+      </w:r>
+    </w:p>
+    <w:tbl>
+      <w:tblPr>
+        <w:tblW w:w="5000" w:type="pct"/>
+        <w:tblBorders>
+          <w:top w:val="single" w:sz="4" w:color="BBBBBB"/>
+          <w:left w:val="single" w:sz="4" w:color="BBBBBB"/>
+          <w:bottom w:val="single" w:sz="4" w:color="BBBBBB"/>
+          <w:right w:val="single" w:sz="4" w:color="BBBBBB"/>
+          <w:insideH w:val="single" w:sz="4" w:color="BBBBBB"/>
+          <w:insideV w:val="single" w:sz="4" w:color="BBBBBB"/>
+        </w:tblBorders>
+        <w:tblCellMar>
+          <w:left w:w="80" w:type="dxa"/>
+          <w:right w:w="80" w:type="dxa"/>
+        </w:tblCellMar>
+      </w:tblPr>
+      <w:tblGrid>
+        <w:gridCol w:w="3200"/>
+        <w:gridCol w:w="3200"/>
+        <w:gridCol w:w="3200"/>
+      </w:tblGrid>
+      <w:tr>
+        <w:trPr>
+          <w:tblHeader/>
+          <w:cantSplit/>
+        </w:trPr>
+        <w:tc>
+          <w:tcPr>
+            <w:tcW w:w="3200" w:type="dxa"/>
+            <w:shd w:val="clear" w:color="auto" w:fill="222222"/>
+          </w:tcPr>
+          <w:p>
+            <w:pPr>
+              <w:spacing w:before="20" w:after="20"/>
+            </w:pPr>
+            <w:r>
+              <w:rPr>
+                <w:b/>
+                <w:color w:val="FFFFFF"/>
+                <w:sz w:val="19"/>
+              </w:rPr>
+              <w:t xml:space="preserve">Запрос</w:t>
+            </w:r>
+          </w:p>
+        </w:tc>
+        <w:tc>
+          <w:tcPr>
+            <w:tcW w:w="3200" w:type="dxa"/>
+            <w:shd w:val="clear" w:color="auto" w:fill="222222"/>
+          </w:tcPr>
+          <w:p>
+            <w:pPr>
+              <w:spacing w:before="20" w:after="20"/>
+            </w:pPr>
+            <w:r>
+              <w:rPr>
+                <w:b/>
+                <w:color w:val="FFFFFF"/>
+                <w:sz w:val="19"/>
+              </w:rPr>
+              <w:t xml:space="preserve">Ключей нет</w:t>
+            </w:r>
+          </w:p>
+        </w:tc>
+        <w:tc>
+          <w:tcPr>
+            <w:tcW w:w="3200" w:type="dxa"/>
+            <w:shd w:val="clear" w:color="auto" w:fill="222222"/>
+          </w:tcPr>
+          <w:p>
+            <w:pPr>
+              <w:spacing w:before="20" w:after="20"/>
+            </w:pPr>
+            <w:r>
+              <w:rPr>
+                <w:b/>
+                <w:color w:val="FFFFFF"/>
+                <w:sz w:val="19"/>
+              </w:rPr>
+              <w:t xml:space="preserve">Ключи есть</w:t>
+            </w:r>
+          </w:p>
+        </w:tc>
+      </w:tr>
+      <w:tr>
+        <w:trPr>
+          <w:cantSplit/>
+        </w:trPr>
+        <w:tc>
+          <w:tcPr>
+            <w:tcW w:w="3200" w:type="dxa"/>
+          </w:tcPr>
+          <w:p>
+            <w:pPr>
+              <w:spacing w:before="20" w:after="20"/>
+            </w:pPr>
+            <w:r>
+              <w:rPr>
+                <w:rFonts w:ascii="Consolas" w:hAnsi="Consolas" w:cs="Consolas"/>
+                <w:color w:val="B4235A"/>
+                <w:sz w:val="19"/>
+              </w:rPr>
+              <w:t xml:space="preserve">POST /api/orders/checkout-session</w:t>
+            </w:r>
+            <w:r>
+              <w:rPr>
+                <w:sz w:val="19"/>
+              </w:rPr>
+              <w:t xml:space="preserve"> с пустым телом</w:t>
+            </w:r>
+          </w:p>
+        </w:tc>
+        <w:tc>
+          <w:tcPr>
+            <w:tcW w:w="3200" w:type="dxa"/>
+          </w:tcPr>
+          <w:p>
+            <w:pPr>
+              <w:spacing w:before="20" w:after="20"/>
+            </w:pPr>
+            <w:r>
+              <w:rPr>
+                <w:rFonts w:ascii="Consolas" w:hAnsi="Consolas" w:cs="Consolas"/>
+                <w:color w:val="B4235A"/>
+                <w:sz w:val="19"/>
+              </w:rPr>
+              <w:t xml:space="preserve">501 Payments are not configured</w:t>
+            </w:r>
+          </w:p>
+        </w:tc>
+        <w:tc>
+          <w:tcPr>
+            <w:tcW w:w="3200" w:type="dxa"/>
+          </w:tcPr>
+          <w:p>
+            <w:pPr>
+              <w:spacing w:before="20" w:after="20"/>
+            </w:pPr>
+            <w:r>
+              <w:rPr>
+                <w:rFonts w:ascii="Consolas" w:hAnsi="Consolas" w:cs="Consolas"/>
+                <w:color w:val="B4235A"/>
+                <w:sz w:val="19"/>
+              </w:rPr>
+              <w:t xml:space="preserve">400 Name and email are required</w:t>
+            </w:r>
+          </w:p>
+        </w:tc>
+      </w:tr>
+      <w:tr>
+        <w:trPr>
+          <w:cantSplit/>
+        </w:trPr>
+        <w:tc>
+          <w:tcPr>
+            <w:tcW w:w="3200" w:type="dxa"/>
+          </w:tcPr>
+          <w:p>
+            <w:pPr>
+              <w:spacing w:before="20" w:after="20"/>
+            </w:pPr>
+            <w:r>
+              <w:rPr>
+                <w:rFonts w:ascii="Consolas" w:hAnsi="Consolas" w:cs="Consolas"/>
+                <w:color w:val="B4235A"/>
+                <w:sz w:val="19"/>
+              </w:rPr>
+              <w:t xml:space="preserve">POST /api/orders/webhook</w:t>
+            </w:r>
+            <w:r>
+              <w:rPr>
+                <w:sz w:val="19"/>
+              </w:rPr>
+              <w:t xml:space="preserve"> без подписи</w:t>
+            </w:r>
+          </w:p>
+        </w:tc>
+        <w:tc>
+          <w:tcPr>
+            <w:tcW w:w="3200" w:type="dxa"/>
+          </w:tcPr>
+          <w:p>
+            <w:pPr>
+              <w:spacing w:before="20" w:after="20"/>
+            </w:pPr>
+            <w:r>
+              <w:rPr>
+                <w:rFonts w:ascii="Consolas" w:hAnsi="Consolas" w:cs="Consolas"/>
+                <w:color w:val="B4235A"/>
+                <w:sz w:val="19"/>
+              </w:rPr>
+              <w:t xml:space="preserve">501 Stripe webhook not configured</w:t>
+            </w:r>
+          </w:p>
+        </w:tc>
+        <w:tc>
+          <w:tcPr>
+            <w:tcW w:w="3200" w:type="dxa"/>
+          </w:tcPr>
+          <w:p>
+            <w:pPr>
+              <w:spacing w:before="20" w:after="20"/>
+            </w:pPr>
+            <w:r>
+              <w:rPr>
+                <w:rFonts w:ascii="Consolas" w:hAnsi="Consolas" w:cs="Consolas"/>
+                <w:color w:val="B4235A"/>
+                <w:sz w:val="19"/>
+              </w:rPr>
+              <w:t xml:space="preserve">400 Webhook Error: No stripe-signature...</w:t>
+            </w:r>
+          </w:p>
+        </w:tc>
+      </w:tr>
+    </w:tbl>
+    <w:p>
+      <w:pPr>
+        <w:spacing w:after="60"/>
+      </w:pPr>
+    </w:p>
+    <w:p>
+      <w:pPr>
+        <w:pStyle w:val="Heading3"/>
+      </w:pPr>
+      <w:r>
+        <w:t xml:space="preserve">Путь оплаты целиком</w:t>
+      </w:r>
+    </w:p>
+    <w:p>
+      <w:pPr>
+        <w:spacing w:after="60"/>
+        <w:ind w:left="400" w:hanging="300"/>
+      </w:pPr>
+      <w:r>
+        <w:t xml:space="preserve">1. </w:t>
+      </w:r>
+      <w:r>
+        <w:t xml:space="preserve">Покупатель на </w:t>
+      </w:r>
+      <w:r>
+        <w:rPr>
+          <w:rFonts w:ascii="Consolas" w:hAnsi="Consolas" w:cs="Consolas"/>
+          <w:color w:val="B4235A"/>
+          <w:sz w:val="19"/>
+        </w:rPr>
+        <w:t xml:space="preserve">/checkout</w:t>
+      </w:r>
+      <w:r>
+        <w:t xml:space="preserve"> нажимает </w:t>
+      </w:r>
+      <w:r>
+        <w:rPr>
+          <w:b/>
+        </w:rPr>
+        <w:t xml:space="preserve">Proceed to Payment</w:t>
+      </w:r>
+      <w:r>
+        <w:t xml:space="preserve">.</w:t>
+      </w:r>
+    </w:p>
+    <w:p>
+      <w:pPr>
+        <w:spacing w:after="60"/>
+        <w:ind w:left="400" w:hanging="300"/>
+      </w:pPr>
+      <w:r>
+        <w:t xml:space="preserve">2. </w:t>
+      </w:r>
+      <w:r>
+        <w:t xml:space="preserve">Сервер проверяет остатки, считает цену сам, создаёт заказ </w:t>
+      </w:r>
+      <w:r>
+        <w:rPr>
+          <w:rFonts w:ascii="Consolas" w:hAnsi="Consolas" w:cs="Consolas"/>
+          <w:color w:val="B4235A"/>
+          <w:sz w:val="19"/>
+        </w:rPr>
+        <w:t xml:space="preserve">pending</w:t>
+      </w:r>
+      <w:r>
+        <w:t xml:space="preserve">, создаёт сессию Stripe и возвращает ссылку.</w:t>
+      </w:r>
+    </w:p>
+    <w:p>
+      <w:pPr>
+        <w:spacing w:after="60"/>
+        <w:ind w:left="400" w:hanging="300"/>
+      </w:pPr>
+      <w:r>
+        <w:t xml:space="preserve">3. </w:t>
+      </w:r>
+      <w:r>
+        <w:t xml:space="preserve">Браузер уходит на страницу Stripe, покупатель вводит карту.</w:t>
+      </w:r>
+    </w:p>
+    <w:p>
+      <w:pPr>
+        <w:spacing w:after="60"/>
+        <w:ind w:left="400" w:hanging="300"/>
+      </w:pPr>
+      <w:r>
+        <w:t xml:space="preserve">4. </w:t>
+      </w:r>
+      <w:r>
+        <w:t xml:space="preserve">Stripe отправляет вебхук на сервер → заказ становится </w:t>
+      </w:r>
+      <w:r>
+        <w:rPr>
+          <w:rFonts w:ascii="Consolas" w:hAnsi="Consolas" w:cs="Consolas"/>
+          <w:color w:val="B4235A"/>
+          <w:sz w:val="19"/>
+        </w:rPr>
+        <w:t xml:space="preserve">paid</w:t>
+      </w:r>
+      <w:r>
+        <w:t xml:space="preserve">, остаток уменьшается, уходят письма покупателю и менеджеру.</w:t>
+      </w:r>
+    </w:p>
+    <w:p>
+      <w:pPr>
+        <w:spacing w:after="60"/>
+        <w:ind w:left="400" w:hanging="300"/>
+      </w:pPr>
+      <w:r>
+        <w:t xml:space="preserve">5. </w:t>
+      </w:r>
+      <w:r>
+        <w:t xml:space="preserve">Stripe возвращает покупателя на </w:t>
+      </w:r>
+      <w:r>
+        <w:rPr>
+          <w:rFonts w:ascii="Consolas" w:hAnsi="Consolas" w:cs="Consolas"/>
+          <w:color w:val="B4235A"/>
+          <w:sz w:val="19"/>
+        </w:rPr>
+        <w:t xml:space="preserve">/order-success?session_id=...</w:t>
+      </w:r>
+      <w:r>
+        <w:t xml:space="preserve"> → страница показывает номер заказа и очищает корзину.</w:t>
+      </w:r>
+    </w:p>
+    <w:p>
+      <w:pPr>
+        <w:spacing w:after="60"/>
+        <w:ind w:left="400" w:hanging="300"/>
+      </w:pPr>
+      <w:r>
+        <w:t xml:space="preserve">6. </w:t>
+      </w:r>
+      <w:r>
+        <w:t xml:space="preserve">Менеджер видит заказ в </w:t>
+      </w:r>
+      <w:r>
+        <w:rPr>
+          <w:rFonts w:ascii="Consolas" w:hAnsi="Consolas" w:cs="Consolas"/>
+          <w:color w:val="B4235A"/>
+          <w:sz w:val="19"/>
+        </w:rPr>
+        <w:t xml:space="preserve">/admin/orders</w:t>
+      </w:r>
+      <w:r>
+        <w:t xml:space="preserve"> со статусом </w:t>
+      </w:r>
+      <w:r>
+        <w:rPr>
+          <w:b/>
+        </w:rPr>
+        <w:t xml:space="preserve">paid</w:t>
+      </w:r>
+      <w:r>
+        <w:t xml:space="preserve">.</w:t>
+      </w:r>
+    </w:p>
+    <w:p>
+      <w:r>
+        <w:t xml:space="preserve">Если заказ остался </w:t>
+      </w:r>
+      <w:r>
+        <w:rPr>
+          <w:rFonts w:ascii="Consolas" w:hAnsi="Consolas" w:cs="Consolas"/>
+          <w:color w:val="B4235A"/>
+          <w:sz w:val="19"/>
+        </w:rPr>
+        <w:t xml:space="preserve">pending</w:t>
+      </w:r>
+      <w:r>
+        <w:t xml:space="preserve">, значит, вебхук не дошёл. Причину видно в Stripe → Webhooks → этот вебхук → попытки доставки.</w:t>
+      </w:r>
+    </w:p>
+    <w:p>
+      <w:pPr>
+        <w:pStyle w:val="Heading2"/>
+      </w:pPr>
+      <w:r>
+        <w:t xml:space="preserve">8.3 Что было исправлено перед защитой</w:t>
+      </w:r>
+    </w:p>
+    <w:tbl>
+      <w:tblPr>
+        <w:tblW w:w="5000" w:type="pct"/>
+        <w:tblBorders>
+          <w:top w:val="single" w:sz="4" w:color="BBBBBB"/>
+          <w:left w:val="single" w:sz="4" w:color="BBBBBB"/>
+          <w:bottom w:val="single" w:sz="4" w:color="BBBBBB"/>
+          <w:right w:val="single" w:sz="4" w:color="BBBBBB"/>
+          <w:insideH w:val="single" w:sz="4" w:color="BBBBBB"/>
+          <w:insideV w:val="single" w:sz="4" w:color="BBBBBB"/>
+        </w:tblBorders>
+        <w:tblCellMar>
+          <w:left w:w="80" w:type="dxa"/>
+          <w:right w:w="80" w:type="dxa"/>
+        </w:tblCellMar>
+      </w:tblPr>
+      <w:tblGrid>
+        <w:gridCol w:w="3200"/>
+        <w:gridCol w:w="3200"/>
+        <w:gridCol w:w="3200"/>
+      </w:tblGrid>
+      <w:tr>
+        <w:trPr>
+          <w:tblHeader/>
+          <w:cantSplit/>
+        </w:trPr>
+        <w:tc>
+          <w:tcPr>
+            <w:tcW w:w="3200" w:type="dxa"/>
+            <w:shd w:val="clear" w:color="auto" w:fill="222222"/>
+          </w:tcPr>
+          <w:p>
+            <w:pPr>
+              <w:spacing w:before="20" w:after="20"/>
+            </w:pPr>
+            <w:r>
+              <w:rPr>
+                <w:b/>
+                <w:color w:val="FFFFFF"/>
+                <w:sz w:val="19"/>
+              </w:rPr>
+              <w:t xml:space="preserve">Было</w:t>
+            </w:r>
+          </w:p>
+        </w:tc>
+        <w:tc>
+          <w:tcPr>
+            <w:tcW w:w="3200" w:type="dxa"/>
+            <w:shd w:val="clear" w:color="auto" w:fill="222222"/>
+          </w:tcPr>
+          <w:p>
+            <w:pPr>
+              <w:spacing w:before="20" w:after="20"/>
+            </w:pPr>
+            <w:r>
+              <w:rPr>
+                <w:b/>
+                <w:color w:val="FFFFFF"/>
+                <w:sz w:val="19"/>
+              </w:rPr>
+              <w:t xml:space="preserve">Стало</w:t>
+            </w:r>
+          </w:p>
+        </w:tc>
+        <w:tc>
+          <w:tcPr>
+            <w:tcW w:w="3200" w:type="dxa"/>
+            <w:shd w:val="clear" w:color="auto" w:fill="222222"/>
+          </w:tcPr>
+          <w:p>
+            <w:pPr>
+              <w:spacing w:before="20" w:after="20"/>
+            </w:pPr>
+            <w:r>
+              <w:rPr>
+                <w:b/>
+                <w:color w:val="FFFFFF"/>
+                <w:sz w:val="19"/>
+              </w:rPr>
+              <w:t xml:space="preserve">Где</w:t>
+            </w:r>
+          </w:p>
+        </w:tc>
+      </w:tr>
+      <w:tr>
+        <w:trPr>
+          <w:cantSplit/>
+        </w:trPr>
+        <w:tc>
+          <w:tcPr>
+            <w:tcW w:w="3200" w:type="dxa"/>
+          </w:tcPr>
+          <w:p>
+            <w:pPr>
+              <w:spacing w:before="20" w:after="20"/>
+            </w:pPr>
+            <w:r>
+              <w:rPr>
+                <w:sz w:val="19"/>
+              </w:rPr>
+              <w:t xml:space="preserve">цена кастомной сумки приходила из браузера, её можно было подменить</w:t>
+            </w:r>
+          </w:p>
+        </w:tc>
+        <w:tc>
+          <w:tcPr>
+            <w:tcW w:w="3200" w:type="dxa"/>
+          </w:tcPr>
+          <w:p>
+            <w:pPr>
+              <w:spacing w:before="20" w:after="20"/>
+            </w:pPr>
+            <w:r>
+              <w:rPr>
+                <w:sz w:val="19"/>
+              </w:rPr>
+              <w:t xml:space="preserve">сервер считает цену сам по таблицам </w:t>
+            </w:r>
+            <w:r>
+              <w:rPr>
+                <w:rFonts w:ascii="Consolas" w:hAnsi="Consolas" w:cs="Consolas"/>
+                <w:color w:val="B4235A"/>
+                <w:sz w:val="19"/>
+              </w:rPr>
+              <w:t xml:space="preserve">SIZE_PRICES</w:t>
+            </w:r>
+            <w:r>
+              <w:rPr>
+                <w:sz w:val="19"/>
+              </w:rPr>
+              <w:t xml:space="preserve"> и </w:t>
+            </w:r>
+            <w:r>
+              <w:rPr>
+                <w:rFonts w:ascii="Consolas" w:hAnsi="Consolas" w:cs="Consolas"/>
+                <w:color w:val="B4235A"/>
+                <w:sz w:val="19"/>
+              </w:rPr>
+              <w:t xml:space="preserve">STRAP_PRICES</w:t>
+            </w:r>
+          </w:p>
+        </w:tc>
+        <w:tc>
+          <w:tcPr>
+            <w:tcW w:w="3200" w:type="dxa"/>
+          </w:tcPr>
+          <w:p>
+            <w:pPr>
+              <w:spacing w:before="20" w:after="20"/>
+            </w:pPr>
+            <w:r>
+              <w:rPr>
+                <w:rFonts w:ascii="Consolas" w:hAnsi="Consolas" w:cs="Consolas"/>
+                <w:color w:val="B4235A"/>
+                <w:sz w:val="19"/>
+              </w:rPr>
+              <w:t xml:space="preserve">OrderController.js</w:t>
+            </w:r>
+          </w:p>
+        </w:tc>
+      </w:tr>
+      <w:tr>
+        <w:trPr>
+          <w:cantSplit/>
+        </w:trPr>
+        <w:tc>
+          <w:tcPr>
+            <w:tcW w:w="3200" w:type="dxa"/>
+          </w:tcPr>
+          <w:p>
+            <w:pPr>
+              <w:spacing w:before="20" w:after="20"/>
+            </w:pPr>
+            <w:r>
+              <w:rPr>
+                <w:sz w:val="19"/>
+              </w:rPr>
+              <w:t xml:space="preserve">изменённое количество в корзине терялось после перезагрузки</w:t>
+            </w:r>
+          </w:p>
+        </w:tc>
+        <w:tc>
+          <w:tcPr>
+            <w:tcW w:w="3200" w:type="dxa"/>
+          </w:tcPr>
+          <w:p>
+            <w:pPr>
+              <w:spacing w:before="20" w:after="20"/>
+            </w:pPr>
+            <w:r>
+              <w:rPr>
+                <w:sz w:val="19"/>
+              </w:rPr>
+              <w:t xml:space="preserve">новый адрес </w:t>
+            </w:r>
+            <w:r>
+              <w:rPr>
+                <w:rFonts w:ascii="Consolas" w:hAnsi="Consolas" w:cs="Consolas"/>
+                <w:color w:val="B4235A"/>
+                <w:sz w:val="19"/>
+              </w:rPr>
+              <w:t xml:space="preserve">PATCH /api/cart/:productId</w:t>
+            </w:r>
+            <w:r>
+              <w:rPr>
+                <w:sz w:val="19"/>
+              </w:rPr>
+              <w:t xml:space="preserve"> сохраняет его на сервере</w:t>
+            </w:r>
+          </w:p>
+        </w:tc>
+        <w:tc>
+          <w:tcPr>
+            <w:tcW w:w="3200" w:type="dxa"/>
+          </w:tcPr>
+          <w:p>
+            <w:pPr>
+              <w:spacing w:before="20" w:after="20"/>
+            </w:pPr>
+            <w:r>
+              <w:rPr>
+                <w:rFonts w:ascii="Consolas" w:hAnsi="Consolas" w:cs="Consolas"/>
+                <w:color w:val="B4235A"/>
+                <w:sz w:val="19"/>
+              </w:rPr>
+              <w:t xml:space="preserve">CartController.js</w:t>
+            </w:r>
+            <w:r>
+              <w:rPr>
+                <w:sz w:val="19"/>
+              </w:rPr>
+              <w:t xml:space="preserve">, </w:t>
+            </w:r>
+            <w:r>
+              <w:rPr>
+                <w:rFonts w:ascii="Consolas" w:hAnsi="Consolas" w:cs="Consolas"/>
+                <w:color w:val="B4235A"/>
+                <w:sz w:val="19"/>
+              </w:rPr>
+              <w:t xml:space="preserve">cartRoute.js</w:t>
+            </w:r>
+            <w:r>
+              <w:rPr>
+                <w:sz w:val="19"/>
+              </w:rPr>
+              <w:t xml:space="preserve">, </w:t>
+            </w:r>
+            <w:r>
+              <w:rPr>
+                <w:rFonts w:ascii="Consolas" w:hAnsi="Consolas" w:cs="Consolas"/>
+                <w:color w:val="B4235A"/>
+                <w:sz w:val="19"/>
+              </w:rPr>
+              <w:t xml:space="preserve">CartContext.jsx</w:t>
+            </w:r>
+          </w:p>
+        </w:tc>
+      </w:tr>
+      <w:tr>
+        <w:trPr>
+          <w:cantSplit/>
+        </w:trPr>
+        <w:tc>
+          <w:tcPr>
+            <w:tcW w:w="3200" w:type="dxa"/>
+          </w:tcPr>
+          <w:p>
+            <w:pPr>
+              <w:spacing w:before="20" w:after="20"/>
+            </w:pPr>
+            <w:r>
+              <w:rPr>
+                <w:sz w:val="19"/>
+              </w:rPr>
+              <w:t xml:space="preserve">кастомная сумка вошедшего пользователя пропадала после перезагрузки</w:t>
+            </w:r>
+          </w:p>
+        </w:tc>
+        <w:tc>
+          <w:tcPr>
+            <w:tcW w:w="3200" w:type="dxa"/>
+          </w:tcPr>
+          <w:p>
+            <w:pPr>
+              <w:spacing w:before="20" w:after="20"/>
+            </w:pPr>
+            <w:r>
+              <w:rPr>
+                <w:sz w:val="19"/>
+              </w:rPr>
+              <w:t xml:space="preserve">хранится в браузере под ключом </w:t>
+            </w:r>
+            <w:r>
+              <w:rPr>
+                <w:rFonts w:ascii="Consolas" w:hAnsi="Consolas" w:cs="Consolas"/>
+                <w:color w:val="B4235A"/>
+                <w:sz w:val="19"/>
+              </w:rPr>
+              <w:t xml:space="preserve">customItems</w:t>
+            </w:r>
+          </w:p>
+        </w:tc>
+        <w:tc>
+          <w:tcPr>
+            <w:tcW w:w="3200" w:type="dxa"/>
+          </w:tcPr>
+          <w:p>
+            <w:pPr>
+              <w:spacing w:before="20" w:after="20"/>
+            </w:pPr>
+            <w:r>
+              <w:rPr>
+                <w:rFonts w:ascii="Consolas" w:hAnsi="Consolas" w:cs="Consolas"/>
+                <w:color w:val="B4235A"/>
+                <w:sz w:val="19"/>
+              </w:rPr>
+              <w:t xml:space="preserve">CartContext.jsx</w:t>
+            </w:r>
+            <w:r>
+              <w:rPr>
+                <w:sz w:val="19"/>
+              </w:rPr>
+              <w:t xml:space="preserve">, </w:t>
+            </w:r>
+            <w:r>
+              <w:rPr>
+                <w:rFonts w:ascii="Consolas" w:hAnsi="Consolas" w:cs="Consolas"/>
+                <w:color w:val="B4235A"/>
+                <w:sz w:val="19"/>
+              </w:rPr>
+              <w:t xml:space="preserve">Header.jsx</w:t>
+            </w:r>
+          </w:p>
+        </w:tc>
+      </w:tr>
+      <w:tr>
+        <w:trPr>
+          <w:cantSplit/>
+        </w:trPr>
+        <w:tc>
+          <w:tcPr>
+            <w:tcW w:w="3200" w:type="dxa"/>
+          </w:tcPr>
+          <w:p>
+            <w:pPr>
+              <w:spacing w:before="20" w:after="20"/>
+            </w:pPr>
+            <w:r>
+              <w:rPr>
+                <w:sz w:val="19"/>
+              </w:rPr>
+              <w:t xml:space="preserve">после оплаты корзина вошедшего пользователя оставалась на сервере</w:t>
+            </w:r>
+          </w:p>
+        </w:tc>
+        <w:tc>
+          <w:tcPr>
+            <w:tcW w:w="3200" w:type="dxa"/>
+          </w:tcPr>
+          <w:p>
+            <w:pPr>
+              <w:spacing w:before="20" w:after="20"/>
+            </w:pPr>
+            <w:r>
+              <w:rPr>
+                <w:sz w:val="19"/>
+              </w:rPr>
+              <w:t xml:space="preserve">новый адрес </w:t>
+            </w:r>
+            <w:r>
+              <w:rPr>
+                <w:rFonts w:ascii="Consolas" w:hAnsi="Consolas" w:cs="Consolas"/>
+                <w:color w:val="B4235A"/>
+                <w:sz w:val="19"/>
+              </w:rPr>
+              <w:t xml:space="preserve">DELETE /api/cart</w:t>
+            </w:r>
+            <w:r>
+              <w:rPr>
+                <w:sz w:val="19"/>
+              </w:rPr>
+              <w:t xml:space="preserve"> очищает её</w:t>
+            </w:r>
+          </w:p>
+        </w:tc>
+        <w:tc>
+          <w:tcPr>
+            <w:tcW w:w="3200" w:type="dxa"/>
+          </w:tcPr>
+          <w:p>
+            <w:pPr>
+              <w:spacing w:before="20" w:after="20"/>
+            </w:pPr>
+            <w:r>
+              <w:rPr>
+                <w:rFonts w:ascii="Consolas" w:hAnsi="Consolas" w:cs="Consolas"/>
+                <w:color w:val="B4235A"/>
+                <w:sz w:val="19"/>
+              </w:rPr>
+              <w:t xml:space="preserve">CartController.js</w:t>
+            </w:r>
+            <w:r>
+              <w:rPr>
+                <w:sz w:val="19"/>
+              </w:rPr>
+              <w:t xml:space="preserve">, </w:t>
+            </w:r>
+            <w:r>
+              <w:rPr>
+                <w:rFonts w:ascii="Consolas" w:hAnsi="Consolas" w:cs="Consolas"/>
+                <w:color w:val="B4235A"/>
+                <w:sz w:val="19"/>
+              </w:rPr>
+              <w:t xml:space="preserve">CartContext.jsx</w:t>
+            </w:r>
+          </w:p>
+        </w:tc>
+      </w:tr>
+      <w:tr>
+        <w:trPr>
+          <w:cantSplit/>
+        </w:trPr>
+        <w:tc>
+          <w:tcPr>
+            <w:tcW w:w="3200" w:type="dxa"/>
+          </w:tcPr>
+          <w:p>
+            <w:pPr>
+              <w:spacing w:before="20" w:after="20"/>
+            </w:pPr>
+            <w:r>
+              <w:rPr>
+                <w:sz w:val="19"/>
+              </w:rPr>
+              <w:t xml:space="preserve">страница товаров менеджера называлась </w:t>
+            </w:r>
+            <w:r>
+              <w:rPr>
+                <w:rFonts w:ascii="Consolas" w:hAnsi="Consolas" w:cs="Consolas"/>
+                <w:color w:val="B4235A"/>
+                <w:sz w:val="19"/>
+              </w:rPr>
+              <w:t xml:space="preserve">AdminPage</w:t>
+            </w:r>
+          </w:p>
+        </w:tc>
+        <w:tc>
+          <w:tcPr>
+            <w:tcW w:w="3200" w:type="dxa"/>
+          </w:tcPr>
+          <w:p>
+            <w:pPr>
+              <w:spacing w:before="20" w:after="20"/>
+            </w:pPr>
+            <w:r>
+              <w:rPr>
+                <w:rFonts w:ascii="Consolas" w:hAnsi="Consolas" w:cs="Consolas"/>
+                <w:color w:val="B4235A"/>
+                <w:sz w:val="19"/>
+              </w:rPr>
+              <w:t xml:space="preserve">ManagerProductsPage</w:t>
+            </w:r>
+            <w:r>
+              <w:rPr>
+                <w:sz w:val="19"/>
+              </w:rPr>
+              <w:t xml:space="preserve">, в пару к </w:t>
+            </w:r>
+            <w:r>
+              <w:rPr>
+                <w:rFonts w:ascii="Consolas" w:hAnsi="Consolas" w:cs="Consolas"/>
+                <w:color w:val="B4235A"/>
+                <w:sz w:val="19"/>
+              </w:rPr>
+              <w:t xml:space="preserve">ManagerOrdersPage</w:t>
+            </w:r>
+          </w:p>
+        </w:tc>
+        <w:tc>
+          <w:tcPr>
+            <w:tcW w:w="3200" w:type="dxa"/>
+          </w:tcPr>
+          <w:p>
+            <w:pPr>
+              <w:spacing w:before="20" w:after="20"/>
+            </w:pPr>
+            <w:r>
+              <w:rPr>
+                <w:rFonts w:ascii="Consolas" w:hAnsi="Consolas" w:cs="Consolas"/>
+                <w:color w:val="B4235A"/>
+                <w:sz w:val="19"/>
+              </w:rPr>
+              <w:t xml:space="preserve">pages/admin/</w:t>
+            </w:r>
+            <w:r>
+              <w:rPr>
+                <w:sz w:val="19"/>
+              </w:rPr>
+              <w:t xml:space="preserve">, </w:t>
+            </w:r>
+            <w:r>
+              <w:rPr>
+                <w:rFonts w:ascii="Consolas" w:hAnsi="Consolas" w:cs="Consolas"/>
+                <w:color w:val="B4235A"/>
+                <w:sz w:val="19"/>
+              </w:rPr>
+              <w:t xml:space="preserve">App.jsx</w:t>
+            </w:r>
+          </w:p>
+        </w:tc>
+      </w:tr>
+      <w:tr>
+        <w:trPr>
+          <w:cantSplit/>
+        </w:trPr>
+        <w:tc>
+          <w:tcPr>
+            <w:tcW w:w="3200" w:type="dxa"/>
+          </w:tcPr>
+          <w:p>
+            <w:pPr>
+              <w:spacing w:before="20" w:after="20"/>
+            </w:pPr>
+            <w:r>
+              <w:rPr>
+                <w:sz w:val="19"/>
+              </w:rPr>
+              <w:t xml:space="preserve">оплата на сайте отвечала </w:t>
+            </w:r>
+            <w:r>
+              <w:rPr>
+                <w:rFonts w:ascii="Consolas" w:hAnsi="Consolas" w:cs="Consolas"/>
+                <w:color w:val="B4235A"/>
+                <w:sz w:val="19"/>
+              </w:rPr>
+              <w:t xml:space="preserve">501</w:t>
+            </w:r>
+          </w:p>
+        </w:tc>
+        <w:tc>
+          <w:tcPr>
+            <w:tcW w:w="3200" w:type="dxa"/>
+          </w:tcPr>
+          <w:p>
+            <w:pPr>
+              <w:spacing w:before="20" w:after="20"/>
+            </w:pPr>
+            <w:r>
+              <w:rPr>
+                <w:sz w:val="19"/>
+              </w:rPr>
+              <w:t xml:space="preserve">ключи Stripe добавлены на Render, вебхук создан</w:t>
+            </w:r>
+          </w:p>
+        </w:tc>
+        <w:tc>
+          <w:tcPr>
+            <w:tcW w:w="3200" w:type="dxa"/>
+          </w:tcPr>
+          <w:p>
+            <w:pPr>
+              <w:spacing w:before="20" w:after="20"/>
+            </w:pPr>
+            <w:r>
+              <w:rPr>
+                <w:sz w:val="19"/>
+              </w:rPr>
+              <w:t xml:space="preserve">Render, Stripe</w:t>
+            </w:r>
+          </w:p>
+        </w:tc>
+      </w:tr>
+      <w:tr>
+        <w:trPr>
+          <w:cantSplit/>
+        </w:trPr>
+        <w:tc>
+          <w:tcPr>
+            <w:tcW w:w="3200" w:type="dxa"/>
+          </w:tcPr>
+          <w:p>
+            <w:pPr>
+              <w:spacing w:before="20" w:after="20"/>
+            </w:pPr>
+            <w:r>
+              <w:rPr>
+                <w:sz w:val="19"/>
+              </w:rPr>
+              <w:t xml:space="preserve">комментарий про «7 day token», лог всегда писал «port 5000»</w:t>
+            </w:r>
+          </w:p>
+        </w:tc>
+        <w:tc>
+          <w:tcPr>
+            <w:tcW w:w="3200" w:type="dxa"/>
+          </w:tcPr>
+          <w:p>
+            <w:pPr>
+              <w:spacing w:before="20" w:after="20"/>
+            </w:pPr>
+            <w:r>
+              <w:rPr>
+                <w:sz w:val="19"/>
+              </w:rPr>
+              <w:t xml:space="preserve">исправлено</w:t>
+            </w:r>
+          </w:p>
+        </w:tc>
+        <w:tc>
+          <w:tcPr>
+            <w:tcW w:w="3200" w:type="dxa"/>
+          </w:tcPr>
+          <w:p>
+            <w:pPr>
+              <w:spacing w:before="20" w:after="20"/>
+            </w:pPr>
+            <w:r>
+              <w:rPr>
+                <w:rFonts w:ascii="Consolas" w:hAnsi="Consolas" w:cs="Consolas"/>
+                <w:color w:val="B4235A"/>
+                <w:sz w:val="19"/>
+              </w:rPr>
+              <w:t xml:space="preserve">authMiddleware.js</w:t>
+            </w:r>
+            <w:r>
+              <w:rPr>
+                <w:sz w:val="19"/>
+              </w:rPr>
+              <w:t xml:space="preserve">, </w:t>
+            </w:r>
+            <w:r>
+              <w:rPr>
+                <w:rFonts w:ascii="Consolas" w:hAnsi="Consolas" w:cs="Consolas"/>
+                <w:color w:val="B4235A"/>
+                <w:sz w:val="19"/>
+              </w:rPr>
+              <w:t xml:space="preserve">index.js</w:t>
+            </w:r>
+          </w:p>
+        </w:tc>
+      </w:tr>
+    </w:tbl>
+    <w:p>
+      <w:pPr>
+        <w:spacing w:after="60"/>
+      </w:pPr>
     </w:p>
     <w:sectPr>
       <w:pgSz w:w="11906" w:h="16838"/>

</xml_diff>